<commit_message>
Put the Reddit workflow in the docs
</commit_message>
<xml_diff>
--- a/docs/manuals/DaemonCore-Academy-Mission-OS-Guide-v6.0.0-beta.1.docx
+++ b/docs/manuals/DaemonCore-Academy-Mission-OS-Guide-v6.0.0-beta.1.docx
@@ -325,6 +325,15 @@
     <w:p>
       <w:r>
         <w:br w:type="page"/>
+      </w:r>
+    </w:p>
+    <w:p>
+      <w:r>
+        <w:rPr>
+          <w:rFonts w:ascii="Aptos" w:hAnsi="Aptos"/>
+          <w:color w:val="20242A"/>
+        </w:rPr>
+        <w:t>31 August 2026</w:t>
       </w:r>
     </w:p>
     <w:p>
@@ -858,7 +867,7 @@
                 <w:color w:val="20242A"/>
                 <w:sz w:val="18"/>
               </w:rPr>
-              <w:t>30 August 2026</w:t>
+              <w:t>31 August 2026</w:t>
             </w:r>
           </w:p>
         </w:tc>
@@ -1327,7 +1336,19 @@
           <w:rFonts w:ascii="Aptos" w:hAnsi="Aptos"/>
           <w:color w:val="20242A"/>
         </w:rPr>
-        <w:t>Complete the 12-scenario Mission OS diagnostic.</w:t>
+        <w:t>Use the first-run guide to understand the Learn, Practice, Launch, and Prove stages.</w:t>
+      </w:r>
+    </w:p>
+    <w:p>
+      <w:pPr>
+        <w:pStyle w:val="ListNumber"/>
+      </w:pPr>
+      <w:r>
+        <w:rPr>
+          <w:rFonts w:ascii="Aptos" w:hAnsi="Aptos"/>
+          <w:color w:val="20242A"/>
+        </w:rPr>
+        <w:t>Start in Academy or complete the 12-scenario Mission OS diagnostic to build a route.</w:t>
       </w:r>
     </w:p>
     <w:p>
@@ -1351,7 +1372,7 @@
           <w:rFonts w:ascii="Aptos" w:hAnsi="Aptos"/>
           <w:color w:val="20242A"/>
         </w:rPr>
-        <w:t>Follow the route's next best action rather than collecting random completions.</w:t>
+        <w:t>Follow the persistent next-action guidance rather than collecting random completions.</w:t>
       </w:r>
     </w:p>
     <w:p>
@@ -1388,6 +1409,152 @@
           <w:color w:val="20242A"/>
         </w:rPr>
         <w:t>Revisit the route dashboard and continue from recorded evidence.</w:t>
+      </w:r>
+    </w:p>
+    <w:p>
+      <w:pPr>
+        <w:pStyle w:val="Heading2"/>
+      </w:pPr>
+      <w:r>
+        <w:t>Know when a command is live</w:t>
+      </w:r>
+    </w:p>
+    <w:p>
+      <w:r>
+        <w:rPr>
+          <w:rFonts w:ascii="Aptos" w:hAnsi="Aptos"/>
+          <w:color w:val="20242A"/>
+        </w:rPr>
+        <w:t xml:space="preserve">Lesson pages teach method and contain in-app workbenches. Their command blocks are labeled </w:t>
+      </w:r>
+      <w:r>
+        <w:rPr>
+          <w:rFonts w:ascii="Aptos" w:hAnsi="Aptos"/>
+          <w:b/>
+          <w:color w:val="20242A"/>
+        </w:rPr>
+        <w:t>Reference command // not run here</w:t>
+      </w:r>
+      <w:r>
+        <w:rPr>
+          <w:rFonts w:ascii="Aptos" w:hAnsi="Aptos"/>
+          <w:color w:val="20242A"/>
+        </w:rPr>
+        <w:t xml:space="preserve"> and are worked examples; copying one does not execute it. Do not paste lesson examples into the Windows terminal merely because they look executable.</w:t>
+      </w:r>
+    </w:p>
+    <w:p>
+      <w:r>
+        <w:rPr>
+          <w:rFonts w:ascii="Aptos" w:hAnsi="Aptos"/>
+          <w:color w:val="20242A"/>
+        </w:rPr>
+        <w:t>A command is live only after all three conditions are true:</w:t>
+      </w:r>
+    </w:p>
+    <w:p>
+      <w:pPr>
+        <w:pStyle w:val="ListNumber"/>
+      </w:pPr>
+      <w:r>
+        <w:rPr>
+          <w:rFonts w:ascii="Aptos" w:hAnsi="Aptos"/>
+          <w:color w:val="20242A"/>
+        </w:rPr>
+        <w:t xml:space="preserve">You explicitly selected </w:t>
+      </w:r>
+      <w:r>
+        <w:rPr>
+          <w:rFonts w:ascii="Aptos" w:hAnsi="Aptos"/>
+          <w:b/>
+          <w:color w:val="20242A"/>
+        </w:rPr>
+        <w:t>Launch sealed range</w:t>
+      </w:r>
+      <w:r>
+        <w:rPr>
+          <w:rFonts w:ascii="Aptos" w:hAnsi="Aptos"/>
+          <w:color w:val="20242A"/>
+        </w:rPr>
+        <w:t xml:space="preserve"> from a mission briefing.</w:t>
+      </w:r>
+    </w:p>
+    <w:p>
+      <w:pPr>
+        <w:pStyle w:val="ListNumber"/>
+      </w:pPr>
+      <w:r>
+        <w:rPr>
+          <w:rFonts w:ascii="Aptos" w:hAnsi="Aptos"/>
+          <w:color w:val="20242A"/>
+        </w:rPr>
+        <w:t xml:space="preserve">The app displayed </w:t>
+      </w:r>
+      <w:r>
+        <w:rPr>
+          <w:rFonts w:ascii="Aptos" w:hAnsi="Aptos"/>
+          <w:b/>
+          <w:color w:val="20242A"/>
+        </w:rPr>
+        <w:t>Containment verified</w:t>
+      </w:r>
+      <w:r>
+        <w:rPr>
+          <w:rFonts w:ascii="Aptos" w:hAnsi="Aptos"/>
+          <w:color w:val="20242A"/>
+        </w:rPr>
+        <w:t xml:space="preserve"> after the Docker preflight.</w:t>
+      </w:r>
+    </w:p>
+    <w:p>
+      <w:pPr>
+        <w:pStyle w:val="ListNumber"/>
+      </w:pPr>
+      <w:r>
+        <w:rPr>
+          <w:rFonts w:ascii="Aptos" w:hAnsi="Aptos"/>
+          <w:color w:val="20242A"/>
+        </w:rPr>
+        <w:t xml:space="preserve">The terminal prompt begins with </w:t>
+      </w:r>
+      <w:r>
+        <w:rPr>
+          <w:rFonts w:ascii="Cascadia Mono" w:hAnsi="Cascadia Mono"/>
+          <w:color w:val="E33E48"/>
+          <w:sz w:val="18"/>
+        </w:rPr>
+        <w:t>root@dc-</w:t>
+      </w:r>
+      <w:r>
+        <w:rPr>
+          <w:rFonts w:ascii="Aptos" w:hAnsi="Aptos"/>
+          <w:color w:val="20242A"/>
+        </w:rPr>
+        <w:t>.</w:t>
+      </w:r>
+    </w:p>
+    <w:p>
+      <w:r>
+        <w:rPr>
+          <w:rFonts w:ascii="Aptos" w:hAnsi="Aptos"/>
+          <w:color w:val="20242A"/>
+        </w:rPr>
+        <w:t xml:space="preserve">The first mission defaults to Guided mode and exposes the exact runbook. After a lesson is mastered, its completion screen can open the matching Lab Range, Web Forge, or Enterprise Forge surface. The workflow dock remains available throughout the main app and its </w:t>
+      </w:r>
+      <w:r>
+        <w:rPr>
+          <w:rFonts w:ascii="Aptos" w:hAnsi="Aptos"/>
+          <w:b/>
+          <w:color w:val="20242A"/>
+        </w:rPr>
+        <w:t>How this works</w:t>
+      </w:r>
+      <w:r>
+        <w:rPr>
+          <w:rFonts w:ascii="Aptos" w:hAnsi="Aptos"/>
+          <w:color w:val="20242A"/>
+        </w:rPr>
+        <w:t xml:space="preserve"> control reopens the guide at any time.</w:t>
       </w:r>
     </w:p>
     <w:p>
@@ -4674,7 +4841,7 @@
           <w:rFonts w:ascii="Aptos" w:hAnsi="Aptos"/>
           <w:color w:val="20242A"/>
         </w:rPr>
-        <w:t>Reproduce the supplied command only inside the stated lab context.</w:t>
+        <w:t>Study each reference command as a worked example; the lesson page does not execute it.</w:t>
       </w:r>
     </w:p>
     <w:p>
@@ -4686,7 +4853,7 @@
           <w:rFonts w:ascii="Aptos" w:hAnsi="Aptos"/>
           <w:color w:val="20242A"/>
         </w:rPr>
-        <w:t>Compare the actual output with the expected signal.</w:t>
+        <w:t>Compare the worked example with the stated expected signal.</w:t>
       </w:r>
     </w:p>
     <w:p>
@@ -4698,7 +4865,7 @@
           <w:rFonts w:ascii="Aptos" w:hAnsi="Aptos"/>
           <w:color w:val="20242A"/>
         </w:rPr>
-        <w:t>Explain what the signal proves and what it does not prove.</w:t>
+        <w:t>Explain what the signal would prove and what it would not prove.</w:t>
       </w:r>
     </w:p>
     <w:p>
@@ -4710,7 +4877,7 @@
           <w:rFonts w:ascii="Aptos" w:hAnsi="Aptos"/>
           <w:color w:val="20242A"/>
         </w:rPr>
-        <w:t>Complete the operator exercise and its success criteria.</w:t>
+        <w:t>Complete the in-app operator exercise and its success criteria.</w:t>
       </w:r>
     </w:p>
     <w:p>
@@ -4735,6 +4902,18 @@
           <w:color w:val="20242A"/>
         </w:rPr>
         <w:t>Complete the knowledge validation to record mastery.</w:t>
+      </w:r>
+    </w:p>
+    <w:p>
+      <w:pPr>
+        <w:pStyle w:val="ListNumber"/>
+      </w:pPr>
+      <w:r>
+        <w:rPr>
+          <w:rFonts w:ascii="Aptos" w:hAnsi="Aptos"/>
+          <w:color w:val="20242A"/>
+        </w:rPr>
+        <w:t>Choose whether to return to the pathway or apply the method in the matching live range.</w:t>
       </w:r>
     </w:p>
     <w:p>
@@ -5264,7 +5443,37 @@
           <w:rFonts w:ascii="Aptos" w:hAnsi="Aptos"/>
           <w:color w:val="20242A"/>
         </w:rPr>
-        <w:t>Launch the range and wait for declared services to become ready.</w:t>
+        <w:t xml:space="preserve">Launch the range and wait for </w:t>
+      </w:r>
+      <w:r>
+        <w:rPr>
+          <w:rFonts w:ascii="Aptos" w:hAnsi="Aptos"/>
+          <w:b/>
+          <w:color w:val="20242A"/>
+        </w:rPr>
+        <w:t>Containment verified</w:t>
+      </w:r>
+      <w:r>
+        <w:rPr>
+          <w:rFonts w:ascii="Aptos" w:hAnsi="Aptos"/>
+          <w:color w:val="20242A"/>
+        </w:rPr>
+        <w:t xml:space="preserve"> and a </w:t>
+      </w:r>
+      <w:r>
+        <w:rPr>
+          <w:rFonts w:ascii="Cascadia Mono" w:hAnsi="Cascadia Mono"/>
+          <w:color w:val="E33E48"/>
+          <w:sz w:val="18"/>
+        </w:rPr>
+        <w:t>root@dc-</w:t>
+      </w:r>
+      <w:r>
+        <w:rPr>
+          <w:rFonts w:ascii="Aptos" w:hAnsi="Aptos"/>
+          <w:color w:val="20242A"/>
+        </w:rPr>
+        <w:t xml:space="preserve"> prompt before entering commands.</w:t>
       </w:r>
     </w:p>
     <w:p>

</xml_diff>